<commit_message>
Cambios del 27/04/2026,Ligero error en frmVentaProducto
</commit_message>
<xml_diff>
--- a/OrdenCompra.docx
+++ b/OrdenCompra.docx
@@ -14,7 +14,7 @@
           <w:b/>
           <w:sz w:val="36"/>
         </w:rPr>
-        <w:t>ORDEN DE COMPRA N: 5</w:t>
+        <w:t>ORDEN DE COMPRA N: 20</w:t>
       </w:r>
     </w:p>
     <w:p>
@@ -35,7 +35,7 @@
         <w:rPr>
           <w:sz w:val="24"/>
         </w:rPr>
-        <w:t>Cedula: 111</w:t>
+        <w:t>Cedula: 222</w:t>
       </w:r>
     </w:p>
     <w:p>
@@ -48,7 +48,7 @@
         <w:rPr>
           <w:sz w:val="24"/>
         </w:rPr>
-        <w:t>Nombre Cliente: Ana</w:t>
+        <w:t>Nombre Cliente: Juan</w:t>
       </w:r>
     </w:p>
     <w:p>
@@ -194,7 +194,7 @@
               <w:rPr>
                 <w:sz w:val="24"/>
               </w:rPr>
-              <w:t>0202</w:t>
+              <w:t>0303</w:t>
             </w:r>
           </w:p>
         </w:tc>
@@ -212,7 +212,7 @@
               <w:rPr>
                 <w:sz w:val="24"/>
               </w:rPr>
-              <w:t>Antipulgas</w:t>
+              <w:t>Arena</w:t>
             </w:r>
           </w:p>
         </w:tc>
@@ -230,7 +230,7 @@
               <w:rPr>
                 <w:sz w:val="24"/>
               </w:rPr>
-              <w:t>9000,00</w:t>
+              <w:t>15000,00</w:t>
             </w:r>
           </w:p>
         </w:tc>
@@ -266,105 +266,7 @@
               <w:rPr>
                 <w:sz w:val="24"/>
               </w:rPr>
-              <w:t>9000,00</w:t>
-            </w:r>
-          </w:p>
-        </w:tc>
-      </w:tr>
-      <w:tr>
-        <w:tblPrEx>
-          <w:tblCellMar>
-            <w:top w:w="0" w:type="dxa"/>
-            <w:bottom w:w="0" w:type="dxa"/>
-          </w:tblCellMar>
-        </w:tblPrEx>
-        <w:tc>
-          <w:tcPr>
-            <w:tcW w:w="1767" w:type="dxa"/>
-          </w:tcPr>
-          <w:p>
-            <w:pPr>
-              <w:rPr>
-                <w:sz w:val="24"/>
-              </w:rPr>
-            </w:pPr>
-            <w:r>
-              <w:rPr>
-                <w:sz w:val="24"/>
-              </w:rPr>
-              <w:t>0101</w:t>
-            </w:r>
-          </w:p>
-        </w:tc>
-        <w:tc>
-          <w:tcPr>
-            <w:tcW w:w="1767" w:type="dxa"/>
-          </w:tcPr>
-          <w:p>
-            <w:pPr>
-              <w:rPr>
-                <w:sz w:val="24"/>
-              </w:rPr>
-            </w:pPr>
-            <w:r>
-              <w:rPr>
-                <w:sz w:val="24"/>
-              </w:rPr>
-              <w:t>Concentrado</w:t>
-            </w:r>
-          </w:p>
-        </w:tc>
-        <w:tc>
-          <w:tcPr>
-            <w:tcW w:w="1768" w:type="dxa"/>
-          </w:tcPr>
-          <w:p>
-            <w:pPr>
-              <w:rPr>
-                <w:sz w:val="24"/>
-              </w:rPr>
-            </w:pPr>
-            <w:r>
-              <w:rPr>
-                <w:sz w:val="24"/>
-              </w:rPr>
-              <w:t>12000,00</w:t>
-            </w:r>
-          </w:p>
-        </w:tc>
-        <w:tc>
-          <w:tcPr>
-            <w:tcW w:w="1768" w:type="dxa"/>
-          </w:tcPr>
-          <w:p>
-            <w:pPr>
-              <w:rPr>
-                <w:sz w:val="24"/>
-              </w:rPr>
-            </w:pPr>
-            <w:r>
-              <w:rPr>
-                <w:sz w:val="24"/>
-              </w:rPr>
-              <w:t>2</w:t>
-            </w:r>
-          </w:p>
-        </w:tc>
-        <w:tc>
-          <w:tcPr>
-            <w:tcW w:w="1768" w:type="dxa"/>
-          </w:tcPr>
-          <w:p>
-            <w:pPr>
-              <w:rPr>
-                <w:sz w:val="24"/>
-              </w:rPr>
-            </w:pPr>
-            <w:r>
-              <w:rPr>
-                <w:sz w:val="24"/>
-              </w:rPr>
-              <w:t>24000,00</w:t>
+              <w:t>15000,00</w:t>
             </w:r>
           </w:p>
         </w:tc>
@@ -495,16 +397,16 @@
         <w:noProof/>
       </w:rPr>
       <w:drawing>
-        <wp:inline distT="0" distB="0" distL="0" distR="0" wp14:anchorId="76E3D70C" wp14:editId="1C611496">
+        <wp:inline distT="0" distB="0" distL="0" distR="0" wp14:anchorId="3AFA2E4C" wp14:editId="3203C05C">
           <wp:extent cx="4737100" cy="5080000"/>
           <wp:effectExtent l="0" t="0" r="6350" b="6350"/>
-          <wp:docPr id="1979347814" name="Imagen 1"/>
+          <wp:docPr id="652995427" name="Imagen 1"/>
           <wp:cNvGraphicFramePr/>
           <a:graphic xmlns:a="http://schemas.openxmlformats.org/drawingml/2006/main">
             <a:graphicData uri="http://schemas.openxmlformats.org/drawingml/2006/picture">
               <pic:pic xmlns:pic="http://schemas.openxmlformats.org/drawingml/2006/picture">
                 <pic:nvPicPr>
-                  <pic:cNvPr id="1979347814" name=""/>
+                  <pic:cNvPr id="652995427" name=""/>
                   <pic:cNvPicPr/>
                 </pic:nvPicPr>
                 <pic:blipFill>
@@ -956,7 +858,7 @@
     <w:link w:val="Ttulo1Car"/>
     <w:uiPriority w:val="9"/>
     <w:qFormat/>
-    <w:rsid w:val="0011107C"/>
+    <w:rsid w:val="007F365F"/>
     <w:pPr>
       <w:keepNext/>
       <w:keepLines/>
@@ -979,7 +881,7 @@
     <w:semiHidden/>
     <w:unhideWhenUsed/>
     <w:qFormat/>
-    <w:rsid w:val="0011107C"/>
+    <w:rsid w:val="007F365F"/>
     <w:pPr>
       <w:keepNext/>
       <w:keepLines/>
@@ -1002,7 +904,7 @@
     <w:semiHidden/>
     <w:unhideWhenUsed/>
     <w:qFormat/>
-    <w:rsid w:val="0011107C"/>
+    <w:rsid w:val="007F365F"/>
     <w:pPr>
       <w:keepNext/>
       <w:keepLines/>
@@ -1025,7 +927,7 @@
     <w:semiHidden/>
     <w:unhideWhenUsed/>
     <w:qFormat/>
-    <w:rsid w:val="0011107C"/>
+    <w:rsid w:val="007F365F"/>
     <w:pPr>
       <w:keepNext/>
       <w:keepLines/>
@@ -1048,7 +950,7 @@
     <w:semiHidden/>
     <w:unhideWhenUsed/>
     <w:qFormat/>
-    <w:rsid w:val="0011107C"/>
+    <w:rsid w:val="007F365F"/>
     <w:pPr>
       <w:keepNext/>
       <w:keepLines/>
@@ -1069,7 +971,7 @@
     <w:semiHidden/>
     <w:unhideWhenUsed/>
     <w:qFormat/>
-    <w:rsid w:val="0011107C"/>
+    <w:rsid w:val="007F365F"/>
     <w:pPr>
       <w:keepNext/>
       <w:keepLines/>
@@ -1092,7 +994,7 @@
     <w:semiHidden/>
     <w:unhideWhenUsed/>
     <w:qFormat/>
-    <w:rsid w:val="0011107C"/>
+    <w:rsid w:val="007F365F"/>
     <w:pPr>
       <w:keepNext/>
       <w:keepLines/>
@@ -1113,7 +1015,7 @@
     <w:semiHidden/>
     <w:unhideWhenUsed/>
     <w:qFormat/>
-    <w:rsid w:val="0011107C"/>
+    <w:rsid w:val="007F365F"/>
     <w:pPr>
       <w:keepNext/>
       <w:keepLines/>
@@ -1136,7 +1038,7 @@
     <w:semiHidden/>
     <w:unhideWhenUsed/>
     <w:qFormat/>
-    <w:rsid w:val="0011107C"/>
+    <w:rsid w:val="007F365F"/>
     <w:pPr>
       <w:keepNext/>
       <w:keepLines/>
@@ -1180,7 +1082,7 @@
     <w:basedOn w:val="Fuentedeprrafopredeter"/>
     <w:link w:val="Ttulo1"/>
     <w:uiPriority w:val="9"/>
-    <w:rsid w:val="0011107C"/>
+    <w:rsid w:val="007F365F"/>
     <w:rPr>
       <w:rFonts w:asciiTheme="majorHAnsi" w:eastAsiaTheme="majorEastAsia" w:hAnsiTheme="majorHAnsi" w:cstheme="majorBidi"/>
       <w:color w:val="2F5496" w:themeColor="accent1" w:themeShade="BF"/>
@@ -1194,7 +1096,7 @@
     <w:link w:val="Ttulo2"/>
     <w:uiPriority w:val="9"/>
     <w:semiHidden/>
-    <w:rsid w:val="0011107C"/>
+    <w:rsid w:val="007F365F"/>
     <w:rPr>
       <w:rFonts w:asciiTheme="majorHAnsi" w:eastAsiaTheme="majorEastAsia" w:hAnsiTheme="majorHAnsi" w:cstheme="majorBidi"/>
       <w:color w:val="2F5496" w:themeColor="accent1" w:themeShade="BF"/>
@@ -1208,7 +1110,7 @@
     <w:link w:val="Ttulo3"/>
     <w:uiPriority w:val="9"/>
     <w:semiHidden/>
-    <w:rsid w:val="0011107C"/>
+    <w:rsid w:val="007F365F"/>
     <w:rPr>
       <w:rFonts w:eastAsiaTheme="majorEastAsia" w:cstheme="majorBidi"/>
       <w:color w:val="2F5496" w:themeColor="accent1" w:themeShade="BF"/>
@@ -1222,7 +1124,7 @@
     <w:link w:val="Ttulo4"/>
     <w:uiPriority w:val="9"/>
     <w:semiHidden/>
-    <w:rsid w:val="0011107C"/>
+    <w:rsid w:val="007F365F"/>
     <w:rPr>
       <w:rFonts w:eastAsiaTheme="majorEastAsia" w:cstheme="majorBidi"/>
       <w:i/>
@@ -1236,7 +1138,7 @@
     <w:link w:val="Ttulo5"/>
     <w:uiPriority w:val="9"/>
     <w:semiHidden/>
-    <w:rsid w:val="0011107C"/>
+    <w:rsid w:val="007F365F"/>
     <w:rPr>
       <w:rFonts w:eastAsiaTheme="majorEastAsia" w:cstheme="majorBidi"/>
       <w:color w:val="2F5496" w:themeColor="accent1" w:themeShade="BF"/>
@@ -1248,7 +1150,7 @@
     <w:link w:val="Ttulo6"/>
     <w:uiPriority w:val="9"/>
     <w:semiHidden/>
-    <w:rsid w:val="0011107C"/>
+    <w:rsid w:val="007F365F"/>
     <w:rPr>
       <w:rFonts w:eastAsiaTheme="majorEastAsia" w:cstheme="majorBidi"/>
       <w:i/>
@@ -1262,7 +1164,7 @@
     <w:link w:val="Ttulo7"/>
     <w:uiPriority w:val="9"/>
     <w:semiHidden/>
-    <w:rsid w:val="0011107C"/>
+    <w:rsid w:val="007F365F"/>
     <w:rPr>
       <w:rFonts w:eastAsiaTheme="majorEastAsia" w:cstheme="majorBidi"/>
       <w:color w:val="595959" w:themeColor="text1" w:themeTint="A6"/>
@@ -1274,7 +1176,7 @@
     <w:link w:val="Ttulo8"/>
     <w:uiPriority w:val="9"/>
     <w:semiHidden/>
-    <w:rsid w:val="0011107C"/>
+    <w:rsid w:val="007F365F"/>
     <w:rPr>
       <w:rFonts w:eastAsiaTheme="majorEastAsia" w:cstheme="majorBidi"/>
       <w:i/>
@@ -1288,7 +1190,7 @@
     <w:link w:val="Ttulo9"/>
     <w:uiPriority w:val="9"/>
     <w:semiHidden/>
-    <w:rsid w:val="0011107C"/>
+    <w:rsid w:val="007F365F"/>
     <w:rPr>
       <w:rFonts w:eastAsiaTheme="majorEastAsia" w:cstheme="majorBidi"/>
       <w:color w:val="272727" w:themeColor="text1" w:themeTint="D8"/>
@@ -1301,7 +1203,7 @@
     <w:link w:val="TtuloCar"/>
     <w:uiPriority w:val="10"/>
     <w:qFormat/>
-    <w:rsid w:val="0011107C"/>
+    <w:rsid w:val="007F365F"/>
     <w:pPr>
       <w:spacing w:after="80" w:line="240" w:lineRule="auto"/>
       <w:contextualSpacing/>
@@ -1319,7 +1221,7 @@
     <w:basedOn w:val="Fuentedeprrafopredeter"/>
     <w:link w:val="Ttulo"/>
     <w:uiPriority w:val="10"/>
-    <w:rsid w:val="0011107C"/>
+    <w:rsid w:val="007F365F"/>
     <w:rPr>
       <w:rFonts w:asciiTheme="majorHAnsi" w:eastAsiaTheme="majorEastAsia" w:hAnsiTheme="majorHAnsi" w:cstheme="majorBidi"/>
       <w:spacing w:val="-10"/>
@@ -1335,7 +1237,7 @@
     <w:link w:val="SubttuloCar"/>
     <w:uiPriority w:val="11"/>
     <w:qFormat/>
-    <w:rsid w:val="0011107C"/>
+    <w:rsid w:val="007F365F"/>
     <w:pPr>
       <w:numPr>
         <w:ilvl w:val="1"/>
@@ -1354,7 +1256,7 @@
     <w:basedOn w:val="Fuentedeprrafopredeter"/>
     <w:link w:val="Subttulo"/>
     <w:uiPriority w:val="11"/>
-    <w:rsid w:val="0011107C"/>
+    <w:rsid w:val="007F365F"/>
     <w:rPr>
       <w:rFonts w:eastAsiaTheme="majorEastAsia" w:cstheme="majorBidi"/>
       <w:color w:val="595959" w:themeColor="text1" w:themeTint="A6"/>
@@ -1370,7 +1272,7 @@
     <w:link w:val="CitaCar"/>
     <w:uiPriority w:val="29"/>
     <w:qFormat/>
-    <w:rsid w:val="0011107C"/>
+    <w:rsid w:val="007F365F"/>
     <w:pPr>
       <w:spacing w:before="160"/>
       <w:jc w:val="center"/>
@@ -1386,7 +1288,7 @@
     <w:basedOn w:val="Fuentedeprrafopredeter"/>
     <w:link w:val="Cita"/>
     <w:uiPriority w:val="29"/>
-    <w:rsid w:val="0011107C"/>
+    <w:rsid w:val="007F365F"/>
     <w:rPr>
       <w:i/>
       <w:iCs/>
@@ -1398,7 +1300,7 @@
     <w:basedOn w:val="Normal"/>
     <w:uiPriority w:val="34"/>
     <w:qFormat/>
-    <w:rsid w:val="0011107C"/>
+    <w:rsid w:val="007F365F"/>
     <w:pPr>
       <w:ind w:left="720"/>
       <w:contextualSpacing/>
@@ -1409,7 +1311,7 @@
     <w:basedOn w:val="Fuentedeprrafopredeter"/>
     <w:uiPriority w:val="21"/>
     <w:qFormat/>
-    <w:rsid w:val="0011107C"/>
+    <w:rsid w:val="007F365F"/>
     <w:rPr>
       <w:i/>
       <w:iCs/>
@@ -1423,7 +1325,7 @@
     <w:link w:val="CitadestacadaCar"/>
     <w:uiPriority w:val="30"/>
     <w:qFormat/>
-    <w:rsid w:val="0011107C"/>
+    <w:rsid w:val="007F365F"/>
     <w:pPr>
       <w:pBdr>
         <w:top w:val="single" w:sz="4" w:space="10" w:color="2F5496" w:themeColor="accent1" w:themeShade="BF"/>
@@ -1444,7 +1346,7 @@
     <w:basedOn w:val="Fuentedeprrafopredeter"/>
     <w:link w:val="Citadestacada"/>
     <w:uiPriority w:val="30"/>
-    <w:rsid w:val="0011107C"/>
+    <w:rsid w:val="007F365F"/>
     <w:rPr>
       <w:i/>
       <w:iCs/>
@@ -1456,7 +1358,7 @@
     <w:basedOn w:val="Fuentedeprrafopredeter"/>
     <w:uiPriority w:val="32"/>
     <w:qFormat/>
-    <w:rsid w:val="0011107C"/>
+    <w:rsid w:val="007F365F"/>
     <w:rPr>
       <w:b/>
       <w:bCs/>
@@ -1471,7 +1373,7 @@
     <w:link w:val="EncabezadoCar"/>
     <w:uiPriority w:val="99"/>
     <w:unhideWhenUsed/>
-    <w:rsid w:val="0011107C"/>
+    <w:rsid w:val="007F365F"/>
     <w:pPr>
       <w:tabs>
         <w:tab w:val="center" w:pos="4419"/>
@@ -1485,7 +1387,7 @@
     <w:basedOn w:val="Fuentedeprrafopredeter"/>
     <w:link w:val="Encabezado"/>
     <w:uiPriority w:val="99"/>
-    <w:rsid w:val="0011107C"/>
+    <w:rsid w:val="007F365F"/>
   </w:style>
   <w:style w:type="paragraph" w:styleId="Piedepgina">
     <w:name w:val="footer"/>
@@ -1493,7 +1395,7 @@
     <w:link w:val="PiedepginaCar"/>
     <w:uiPriority w:val="99"/>
     <w:unhideWhenUsed/>
-    <w:rsid w:val="0011107C"/>
+    <w:rsid w:val="007F365F"/>
     <w:pPr>
       <w:tabs>
         <w:tab w:val="center" w:pos="4419"/>
@@ -1507,7 +1409,7 @@
     <w:basedOn w:val="Fuentedeprrafopredeter"/>
     <w:link w:val="Piedepgina"/>
     <w:uiPriority w:val="99"/>
-    <w:rsid w:val="0011107C"/>
+    <w:rsid w:val="007F365F"/>
   </w:style>
 </w:styles>
 </file>

</xml_diff>